<commit_message>
docs: separate the founder's personal record from the company's export record
The Uzbekistan work is Genetics Co., Ltd.'s embryo export record, not a
project the founder took part in as a deployed expert. Conflating the two
would be a false entry on a government form.

- Form 7 keeps only the Nepal project under similar-project experience; the
  Uzbekistan record must never appear there or under overseas assignments
- ET proposal now says Genetics Co., Ltd. exported to Uzbekistan and that this
  validated the export production, quarantine and shipping chain -- the
  earlier claim of on-site transfer experience there is removed
- The distinction is recorded in context/founder-cv-and-awards.md and the
  Nepal project context so later documents do not merge them again

Co-Authored-By: Claude Opus 5 <noreply@anthropic.com>
Claude-Session: https://claude.ai/code/session_01XoYxAkSfRcM555ynDBrJKP
</commit_message>
<xml_diff>
--- a/deliverables/[ET] 성감별 수정란 생산·이송 및 현지 이식 사업 수행계획.docx
+++ b/deliverables/[ET] 성감별 수정란 생산·이송 및 현지 이식 사업 수행계획.docx
@@ -978,51 +978,51 @@
           <w:sz w:val="20"/>
           <w:szCs w:val="20"/>
         </w:rPr>
-        <w:t xml:space="preserve">국제 실적</w:t>
-      </w:r>
-      <w:r>
-        <w:rPr>
-          <w:rFonts w:ascii="Malgun Gothic" w:cs="Malgun Gothic" w:eastAsia="Malgun Gothic" w:hAnsi="Malgun Gothic"/>
-          <w:sz w:val="20"/>
-          <w:szCs w:val="20"/>
-        </w:rPr>
-        <w:t xml:space="preserve"> — 국내에서 개량한 한국형 홀스타인의 우수 유전형질을 성감별(암) 수정란으로 생산하여 </w:t>
-      </w:r>
-      <w:r>
-        <w:rPr>
-          <w:rFonts w:ascii="Malgun Gothic" w:cs="Malgun Gothic" w:eastAsia="Malgun Gothic" w:hAnsi="Malgun Gothic"/>
-          <w:b/>
-          <w:bCs/>
-          <w:sz w:val="20"/>
-          <w:szCs w:val="20"/>
-        </w:rPr>
-        <w:t xml:space="preserve">중앙아시아·동남아시아 및 중동(두바이 허브) 수출 기반을 구축</w:t>
-      </w:r>
-      <w:r>
-        <w:rPr>
-          <w:rFonts w:ascii="Malgun Gothic" w:cs="Malgun Gothic" w:eastAsia="Malgun Gothic" w:hAnsi="Malgun Gothic"/>
-          <w:sz w:val="20"/>
-          <w:szCs w:val="20"/>
-        </w:rPr>
-        <w:t xml:space="preserve">하였으며, 수출검역·건강증명 등 국제 통관 요건을 충족하는 수출용 수정란 생산체계를 갖추고 있습니다. </w:t>
-      </w:r>
-      <w:r>
-        <w:rPr>
-          <w:rFonts w:ascii="Malgun Gothic" w:cs="Malgun Gothic" w:eastAsia="Malgun Gothic" w:hAnsi="Malgun Gothic"/>
-          <w:b/>
-          <w:bCs/>
-          <w:sz w:val="20"/>
-          <w:szCs w:val="20"/>
-        </w:rPr>
-        <w:t xml:space="preserve">농촌진흥청(RDA)과 협력한 우즈베키스탄 공급 사례</w:t>
-      </w:r>
-      <w:r>
-        <w:rPr>
-          <w:rFonts w:ascii="Malgun Gothic" w:cs="Malgun Gothic" w:eastAsia="Malgun Gothic" w:hAnsi="Malgun Gothic"/>
-          <w:sz w:val="20"/>
-          <w:szCs w:val="20"/>
-        </w:rPr>
-        <w:t xml:space="preserve">를 통해 검역·이송·현지 이식의 실무 경험을 확보하였습니다. (세부 수치는 협의 시 제시)</w:t>
+        <w:t xml:space="preserve">수출 실적</w:t>
+      </w:r>
+      <w:r>
+        <w:rPr>
+          <w:rFonts w:ascii="Malgun Gothic" w:cs="Malgun Gothic" w:eastAsia="Malgun Gothic" w:hAnsi="Malgun Gothic"/>
+          <w:sz w:val="20"/>
+          <w:szCs w:val="20"/>
+        </w:rPr>
+        <w:t xml:space="preserve"> — ㈜제네틱스는 국내에서 개량한 한국형 홀스타인의 우수 유전형질을 성감별(암) 수정란으로 생산하여 </w:t>
+      </w:r>
+      <w:r>
+        <w:rPr>
+          <w:rFonts w:ascii="Malgun Gothic" w:cs="Malgun Gothic" w:eastAsia="Malgun Gothic" w:hAnsi="Malgun Gothic"/>
+          <w:b/>
+          <w:bCs/>
+          <w:sz w:val="20"/>
+          <w:szCs w:val="20"/>
+        </w:rPr>
+        <w:t xml:space="preserve">우즈베키스탄에 수출한 실적</w:t>
+      </w:r>
+      <w:r>
+        <w:rPr>
+          <w:rFonts w:ascii="Malgun Gothic" w:cs="Malgun Gothic" w:eastAsia="Malgun Gothic" w:hAnsi="Malgun Gothic"/>
+          <w:sz w:val="20"/>
+          <w:szCs w:val="20"/>
+        </w:rPr>
+        <w:t xml:space="preserve">을 보유하고 있습니다. 이를 통해 수출검역·건강증명 등 국제 통관 요건을 충족하는 </w:t>
+      </w:r>
+      <w:r>
+        <w:rPr>
+          <w:rFonts w:ascii="Malgun Gothic" w:cs="Malgun Gothic" w:eastAsia="Malgun Gothic" w:hAnsi="Malgun Gothic"/>
+          <w:b/>
+          <w:bCs/>
+          <w:sz w:val="20"/>
+          <w:szCs w:val="20"/>
+        </w:rPr>
+        <w:t xml:space="preserve">수출용 수정란 생산· 검역·이송 체계가 실제 통관으로 검증</w:t>
+      </w:r>
+      <w:r>
+        <w:rPr>
+          <w:rFonts w:ascii="Malgun Gothic" w:cs="Malgun Gothic" w:eastAsia="Malgun Gothic" w:hAnsi="Malgun Gothic"/>
+          <w:sz w:val="20"/>
+          <w:szCs w:val="20"/>
+        </w:rPr>
+        <w:t xml:space="preserve">되었으며, 본 사업의 수정란 조달 구간에 그대로 적용할 수 있습니다. (세부 수치는 협의 시 제시)</w:t>
       </w:r>
     </w:p>
     <w:p>

</xml_diff>